<commit_message>
Update CV headline and remove hero note
</commit_message>
<xml_diff>
--- a/content/assets/Dr_Victor_Agughasi_CV.docx
+++ b/content/assets/Dr_Victor_Agughasi_CV.docx
@@ -31,7 +31,7 @@
           <w:color w:val="222222"/>
           <w:sz w:val="22"/>
         </w:rPr>
-        <w:t>Senior Assistant Professor | AI for Healthcare | Medical Imaging | Explainable AI | Multimodal and</w:t>
+        <w:t>Senior Assistant Professor | AI for Healthcare | Medical Imaging | Biomedical Signal Processing</w:t>
       </w:r>
     </w:p>
     <w:p>
@@ -47,7 +47,7 @@
           <w:color w:val="222222"/>
           <w:sz w:val="22"/>
         </w:rPr>
-        <w:t>Agentic AI</w:t>
+        <w:t>Multimodal &amp; Explainable AI | Trustworthy and Agentic AI | Internet of Medical Things (IoMT)</w:t>
       </w:r>
     </w:p>
     <w:p>
@@ -79,8 +79,61 @@
           <w:color w:val="222222"/>
           <w:sz w:val="20"/>
         </w:rPr>
-        <w:t>Mobile: (+91) 7892819690 | Email: victor-csme@dsu.edu.in | Alternate: victor.agughasi@gmail.com</w:t>
+        <w:t xml:space="preserve">Mobile: </w:t>
       </w:r>
+      <w:hyperlink r:id="rId9">
+        <w:r>
+          <w:rPr>
+            <w:color w:val="0563C1"/>
+            <w:u w:val="single"/>
+            <w:rFonts w:ascii="Times New Roman" w:hAnsi="Times New Roman"/>
+            <w:sz w:val="20"/>
+          </w:rPr>
+          <w:t>(+91) 7892819690</w:t>
+        </w:r>
+      </w:hyperlink>
+      <w:r>
+        <w:rPr>
+          <w:rFonts w:ascii="Times New Roman" w:hAnsi="Times New Roman"/>
+          <w:b w:val="0"/>
+          <w:i w:val="0"/>
+          <w:color w:val="222222"/>
+          <w:sz w:val="20"/>
+        </w:rPr>
+        <w:t xml:space="preserve"> | Email: </w:t>
+      </w:r>
+      <w:hyperlink r:id="rId10">
+        <w:r>
+          <w:rPr>
+            <w:color w:val="0563C1"/>
+            <w:u w:val="single"/>
+            <w:rFonts w:ascii="Times New Roman" w:hAnsi="Times New Roman"/>
+            <w:sz w:val="20"/>
+          </w:rPr>
+          <w:t>victor-csme@dsu.edu.in</w:t>
+        </w:r>
+      </w:hyperlink>
+      <w:r>
+        <w:rPr>
+          <w:rFonts w:ascii="Times New Roman" w:hAnsi="Times New Roman"/>
+          <w:b w:val="0"/>
+          <w:i w:val="0"/>
+          <w:color w:val="222222"/>
+          <w:sz w:val="20"/>
+        </w:rPr>
+        <w:t xml:space="preserve"> | Alternate: </w:t>
+      </w:r>
+      <w:hyperlink r:id="rId11">
+        <w:r>
+          <w:rPr>
+            <w:color w:val="0563C1"/>
+            <w:u w:val="single"/>
+            <w:rFonts w:ascii="Times New Roman" w:hAnsi="Times New Roman"/>
+            <w:sz w:val="20"/>
+          </w:rPr>
+          <w:t>victor.agughasi@gmail.com</w:t>
+        </w:r>
+      </w:hyperlink>
     </w:p>
     <w:p>
       <w:pPr>
@@ -95,8 +148,61 @@
           <w:color w:val="222222"/>
           <w:sz w:val="20"/>
         </w:rPr>
-        <w:t>Scopus: Author ID 58663521900 | Google Scholar: TQjqJ1UAAAAJ | ORCID: 0000-0002-1175-3089</w:t>
+        <w:t xml:space="preserve">Scopus: </w:t>
       </w:r>
+      <w:hyperlink r:id="rId12">
+        <w:r>
+          <w:rPr>
+            <w:color w:val="0563C1"/>
+            <w:u w:val="single"/>
+            <w:rFonts w:ascii="Times New Roman" w:hAnsi="Times New Roman"/>
+            <w:sz w:val="20"/>
+          </w:rPr>
+          <w:t>Author ID 58663521900</w:t>
+        </w:r>
+      </w:hyperlink>
+      <w:r>
+        <w:rPr>
+          <w:rFonts w:ascii="Times New Roman" w:hAnsi="Times New Roman"/>
+          <w:b w:val="0"/>
+          <w:i w:val="0"/>
+          <w:color w:val="222222"/>
+          <w:sz w:val="20"/>
+        </w:rPr>
+        <w:t xml:space="preserve"> | Google Scholar: </w:t>
+      </w:r>
+      <w:hyperlink r:id="rId13">
+        <w:r>
+          <w:rPr>
+            <w:color w:val="0563C1"/>
+            <w:u w:val="single"/>
+            <w:rFonts w:ascii="Times New Roman" w:hAnsi="Times New Roman"/>
+            <w:sz w:val="20"/>
+          </w:rPr>
+          <w:t>TQjqJ1UAAAAJ</w:t>
+        </w:r>
+      </w:hyperlink>
+      <w:r>
+        <w:rPr>
+          <w:rFonts w:ascii="Times New Roman" w:hAnsi="Times New Roman"/>
+          <w:b w:val="0"/>
+          <w:i w:val="0"/>
+          <w:color w:val="222222"/>
+          <w:sz w:val="20"/>
+        </w:rPr>
+        <w:t xml:space="preserve"> | ORCID: </w:t>
+      </w:r>
+      <w:hyperlink r:id="rId14">
+        <w:r>
+          <w:rPr>
+            <w:color w:val="0563C1"/>
+            <w:u w:val="single"/>
+            <w:rFonts w:ascii="Times New Roman" w:hAnsi="Times New Roman"/>
+            <w:sz w:val="20"/>
+          </w:rPr>
+          <w:t>0000-0002-1175-3089</w:t>
+        </w:r>
+      </w:hyperlink>
     </w:p>
     <w:p>
       <w:pPr>
@@ -111,8 +217,61 @@
           <w:color w:val="222222"/>
           <w:sz w:val="20"/>
         </w:rPr>
-        <w:t>Vidwan ID: 169687 | ResearchGate: Victor-Ikechukwu-Agughasi | LinkedIn: victor-ikechukwu-agughasi</w:t>
+        <w:t xml:space="preserve">Vidwan ID: </w:t>
       </w:r>
+      <w:hyperlink r:id="rId15">
+        <w:r>
+          <w:rPr>
+            <w:color w:val="0563C1"/>
+            <w:u w:val="single"/>
+            <w:rFonts w:ascii="Times New Roman" w:hAnsi="Times New Roman"/>
+            <w:sz w:val="20"/>
+          </w:rPr>
+          <w:t>169687</w:t>
+        </w:r>
+      </w:hyperlink>
+      <w:r>
+        <w:rPr>
+          <w:rFonts w:ascii="Times New Roman" w:hAnsi="Times New Roman"/>
+          <w:b w:val="0"/>
+          <w:i w:val="0"/>
+          <w:color w:val="222222"/>
+          <w:sz w:val="20"/>
+        </w:rPr>
+        <w:t xml:space="preserve"> | ResearchGate: </w:t>
+      </w:r>
+      <w:hyperlink r:id="rId16">
+        <w:r>
+          <w:rPr>
+            <w:color w:val="0563C1"/>
+            <w:u w:val="single"/>
+            <w:rFonts w:ascii="Times New Roman" w:hAnsi="Times New Roman"/>
+            <w:sz w:val="20"/>
+          </w:rPr>
+          <w:t>Victor-Ikechukwu-Agughasi</w:t>
+        </w:r>
+      </w:hyperlink>
+      <w:r>
+        <w:rPr>
+          <w:rFonts w:ascii="Times New Roman" w:hAnsi="Times New Roman"/>
+          <w:b w:val="0"/>
+          <w:i w:val="0"/>
+          <w:color w:val="222222"/>
+          <w:sz w:val="20"/>
+        </w:rPr>
+        <w:t xml:space="preserve"> | LinkedIn: </w:t>
+      </w:r>
+      <w:hyperlink r:id="rId17">
+        <w:r>
+          <w:rPr>
+            <w:color w:val="0563C1"/>
+            <w:u w:val="single"/>
+            <w:rFonts w:ascii="Times New Roman" w:hAnsi="Times New Roman"/>
+            <w:sz w:val="20"/>
+          </w:rPr>
+          <w:t>victor-ikechukwu-agughasi</w:t>
+        </w:r>
+      </w:hyperlink>
     </w:p>
     <w:p>
       <w:pPr>
@@ -1410,9 +1569,30 @@
           <w:color w:val="222222"/>
           <w:sz w:val="20"/>
         </w:rPr>
-        <w:t xml:space="preserve">"Firefly-Based Segmentation and Residual Deep Learning for Multi-Class Diabetic Retinopathy Detection", Inteligencia Artificial, DOI: </w:t>
+        <w:t>"</w:t>
       </w:r>
-      <w:hyperlink r:id="rId9">
+      <w:hyperlink r:id="rId18">
+        <w:r>
+          <w:rPr>
+            <w:color w:val="0563C1"/>
+            <w:u w:val="single"/>
+            <w:rFonts w:ascii="Times New Roman" w:hAnsi="Times New Roman"/>
+            <w:sz w:val="20"/>
+          </w:rPr>
+          <w:t>Firefly-Based Segmentation and Residual Deep Learning for Multi-Class Diabetic Retinopathy Detection</w:t>
+        </w:r>
+      </w:hyperlink>
+      <w:r>
+        <w:rPr>
+          <w:rFonts w:ascii="Times New Roman" w:hAnsi="Times New Roman"/>
+          <w:b w:val="0"/>
+          <w:i w:val="0"/>
+          <w:color w:val="222222"/>
+          <w:sz w:val="20"/>
+        </w:rPr>
+        <w:t xml:space="preserve">", Inteligencia Artificial, DOI: </w:t>
+      </w:r>
+      <w:hyperlink r:id="rId18">
         <w:r>
           <w:rPr>
             <w:color w:val="0563C1"/>
@@ -1437,9 +1617,30 @@
           <w:color w:val="222222"/>
           <w:sz w:val="20"/>
         </w:rPr>
-        <w:t xml:space="preserve">"Enhancing Early Breast Cancer Detection with Infrared Thermography: A Comparative Evaluation of Deep Learning and Machine Learning Models", Technologies, DOI: </w:t>
+        <w:t>"</w:t>
       </w:r>
-      <w:hyperlink r:id="rId10">
+      <w:hyperlink r:id="rId19">
+        <w:r>
+          <w:rPr>
+            <w:color w:val="0563C1"/>
+            <w:u w:val="single"/>
+            <w:rFonts w:ascii="Times New Roman" w:hAnsi="Times New Roman"/>
+            <w:sz w:val="20"/>
+          </w:rPr>
+          <w:t>Enhancing Early Breast Cancer Detection with Infrared Thermography: A Comparative Evaluation of Deep Learning and Machine Learning Models</w:t>
+        </w:r>
+      </w:hyperlink>
+      <w:r>
+        <w:rPr>
+          <w:rFonts w:ascii="Times New Roman" w:hAnsi="Times New Roman"/>
+          <w:b w:val="0"/>
+          <w:i w:val="0"/>
+          <w:color w:val="222222"/>
+          <w:sz w:val="20"/>
+        </w:rPr>
+        <w:t xml:space="preserve">", Technologies, DOI: </w:t>
+      </w:r>
+      <w:hyperlink r:id="rId19">
         <w:r>
           <w:rPr>
             <w:color w:val="0563C1"/>
@@ -1464,9 +1665,30 @@
           <w:color w:val="222222"/>
           <w:sz w:val="20"/>
         </w:rPr>
-        <w:t xml:space="preserve">"Leveraging Transfer Learning for Efficient Diagnosis of COPD Using CXR Images and Explainable AI Techniques", Inteligencia Artificial, DOI: </w:t>
+        <w:t>"</w:t>
       </w:r>
-      <w:hyperlink r:id="rId11">
+      <w:hyperlink r:id="rId20">
+        <w:r>
+          <w:rPr>
+            <w:color w:val="0563C1"/>
+            <w:u w:val="single"/>
+            <w:rFonts w:ascii="Times New Roman" w:hAnsi="Times New Roman"/>
+            <w:sz w:val="20"/>
+          </w:rPr>
+          <w:t>Leveraging Transfer Learning for Efficient Diagnosis of COPD Using CXR Images and Explainable AI Techniques</w:t>
+        </w:r>
+      </w:hyperlink>
+      <w:r>
+        <w:rPr>
+          <w:rFonts w:ascii="Times New Roman" w:hAnsi="Times New Roman"/>
+          <w:b w:val="0"/>
+          <w:i w:val="0"/>
+          <w:color w:val="222222"/>
+          <w:sz w:val="20"/>
+        </w:rPr>
+        <w:t xml:space="preserve">", Inteligencia Artificial, DOI: </w:t>
+      </w:r>
+      <w:hyperlink r:id="rId20">
         <w:r>
           <w:rPr>
             <w:color w:val="0563C1"/>
@@ -1491,9 +1713,30 @@
           <w:color w:val="222222"/>
           <w:sz w:val="20"/>
         </w:rPr>
-        <w:t xml:space="preserve">"The Superiority of Fine-tuning over Full-training for the Efficient Diagnosis of COPD from CXR Images", Inteligencia Artificial, DOI: </w:t>
+        <w:t>"</w:t>
       </w:r>
-      <w:hyperlink r:id="rId12">
+      <w:hyperlink r:id="rId21">
+        <w:r>
+          <w:rPr>
+            <w:color w:val="0563C1"/>
+            <w:u w:val="single"/>
+            <w:rFonts w:ascii="Times New Roman" w:hAnsi="Times New Roman"/>
+            <w:sz w:val="20"/>
+          </w:rPr>
+          <w:t>The Superiority of Fine-tuning over Full-training for the Efficient Diagnosis of COPD from CXR Images</w:t>
+        </w:r>
+      </w:hyperlink>
+      <w:r>
+        <w:rPr>
+          <w:rFonts w:ascii="Times New Roman" w:hAnsi="Times New Roman"/>
+          <w:b w:val="0"/>
+          <w:i w:val="0"/>
+          <w:color w:val="222222"/>
+          <w:sz w:val="20"/>
+        </w:rPr>
+        <w:t xml:space="preserve">", Inteligencia Artificial, DOI: </w:t>
+      </w:r>
+      <w:hyperlink r:id="rId21">
         <w:r>
           <w:rPr>
             <w:color w:val="0563C1"/>
@@ -1518,9 +1761,30 @@
           <w:color w:val="222222"/>
           <w:sz w:val="20"/>
         </w:rPr>
-        <w:t xml:space="preserve">"CX-Net: An Efficient Ensemble Semantic Deep Neural Network for ROI Identification from Chest X-ray Images for COPD Diagnosis", Machine Learning: Science and Technology, DOI: </w:t>
+        <w:t>"</w:t>
       </w:r>
-      <w:hyperlink r:id="rId13">
+      <w:hyperlink r:id="rId22">
+        <w:r>
+          <w:rPr>
+            <w:color w:val="0563C1"/>
+            <w:u w:val="single"/>
+            <w:rFonts w:ascii="Times New Roman" w:hAnsi="Times New Roman"/>
+            <w:sz w:val="20"/>
+          </w:rPr>
+          <w:t>CX-Net: An Efficient Ensemble Semantic Deep Neural Network for ROI Identification from Chest X-ray Images for COPD Diagnosis</w:t>
+        </w:r>
+      </w:hyperlink>
+      <w:r>
+        <w:rPr>
+          <w:rFonts w:ascii="Times New Roman" w:hAnsi="Times New Roman"/>
+          <w:b w:val="0"/>
+          <w:i w:val="0"/>
+          <w:color w:val="222222"/>
+          <w:sz w:val="20"/>
+        </w:rPr>
+        <w:t xml:space="preserve">", Machine Learning: Science and Technology, DOI: </w:t>
+      </w:r>
+      <w:hyperlink r:id="rId22">
         <w:r>
           <w:rPr>
             <w:color w:val="0563C1"/>
@@ -1545,9 +1809,30 @@
           <w:color w:val="222222"/>
           <w:sz w:val="20"/>
         </w:rPr>
-        <w:t xml:space="preserve">"Energy-Efficient Deep Q-Network (EEDQN): Reinforcement Learning-based Approach to Efficient Routing Protocol in Wireless Internet-of-Things", Indonesian Journal of Electrical Engineering and Computer Science, DOI: </w:t>
+        <w:t>"</w:t>
       </w:r>
-      <w:hyperlink r:id="rId14">
+      <w:hyperlink r:id="rId23">
+        <w:r>
+          <w:rPr>
+            <w:color w:val="0563C1"/>
+            <w:u w:val="single"/>
+            <w:rFonts w:ascii="Times New Roman" w:hAnsi="Times New Roman"/>
+            <w:sz w:val="20"/>
+          </w:rPr>
+          <w:t>Energy-Efficient Deep Q-Network (EEDQN): Reinforcement Learning-based Approach to Efficient Routing Protocol in Wireless Internet-of-Things</w:t>
+        </w:r>
+      </w:hyperlink>
+      <w:r>
+        <w:rPr>
+          <w:rFonts w:ascii="Times New Roman" w:hAnsi="Times New Roman"/>
+          <w:b w:val="0"/>
+          <w:i w:val="0"/>
+          <w:color w:val="222222"/>
+          <w:sz w:val="20"/>
+        </w:rPr>
+        <w:t xml:space="preserve">", Indonesian Journal of Electrical Engineering and Computer Science, DOI: </w:t>
+      </w:r>
+      <w:hyperlink r:id="rId23">
         <w:r>
           <w:rPr>
             <w:color w:val="0563C1"/>
@@ -1572,9 +1857,30 @@
           <w:color w:val="222222"/>
           <w:sz w:val="20"/>
         </w:rPr>
-        <w:t xml:space="preserve">"COPDNet: An Explainable ResNet50 Model for the Diagnosis of COPD from CXR Images", IEEE INDISCON, 2023, DOI: </w:t>
+        <w:t>"</w:t>
       </w:r>
-      <w:hyperlink r:id="rId15">
+      <w:hyperlink r:id="rId24">
+        <w:r>
+          <w:rPr>
+            <w:color w:val="0563C1"/>
+            <w:u w:val="single"/>
+            <w:rFonts w:ascii="Times New Roman" w:hAnsi="Times New Roman"/>
+            <w:sz w:val="20"/>
+          </w:rPr>
+          <w:t>COPDNet: An Explainable ResNet50 Model for the Diagnosis of COPD from CXR Images</w:t>
+        </w:r>
+      </w:hyperlink>
+      <w:r>
+        <w:rPr>
+          <w:rFonts w:ascii="Times New Roman" w:hAnsi="Times New Roman"/>
+          <w:b w:val="0"/>
+          <w:i w:val="0"/>
+          <w:color w:val="222222"/>
+          <w:sz w:val="20"/>
+        </w:rPr>
+        <w:t xml:space="preserve">", IEEE INDISCON, 2023, DOI: </w:t>
+      </w:r>
+      <w:hyperlink r:id="rId24">
         <w:r>
           <w:rPr>
             <w:color w:val="0563C1"/>
@@ -1599,9 +1905,30 @@
           <w:color w:val="222222"/>
           <w:sz w:val="20"/>
         </w:rPr>
-        <w:t xml:space="preserve">"xAI: An Explainable AI Model for the Diagnosis of COPD from CXR Images", IEEE ICDDS, 2023, DOI: </w:t>
+        <w:t>"</w:t>
       </w:r>
-      <w:hyperlink r:id="rId16">
+      <w:hyperlink r:id="rId25">
+        <w:r>
+          <w:rPr>
+            <w:color w:val="0563C1"/>
+            <w:u w:val="single"/>
+            <w:rFonts w:ascii="Times New Roman" w:hAnsi="Times New Roman"/>
+            <w:sz w:val="20"/>
+          </w:rPr>
+          <w:t>xAI: An Explainable AI Model for the Diagnosis of COPD from CXR Images</w:t>
+        </w:r>
+      </w:hyperlink>
+      <w:r>
+        <w:rPr>
+          <w:rFonts w:ascii="Times New Roman" w:hAnsi="Times New Roman"/>
+          <w:b w:val="0"/>
+          <w:i w:val="0"/>
+          <w:color w:val="222222"/>
+          <w:sz w:val="20"/>
+        </w:rPr>
+        <w:t xml:space="preserve">", IEEE ICDDS, 2023, DOI: </w:t>
+      </w:r>
+      <w:hyperlink r:id="rId25">
         <w:r>
           <w:rPr>
             <w:color w:val="0563C1"/>
@@ -1626,9 +1953,30 @@
           <w:color w:val="222222"/>
           <w:sz w:val="20"/>
         </w:rPr>
-        <w:t xml:space="preserve">"i-Net: A Deep CNN Model for White Blood Cancer Segmentation and Classification", International Journal of Advanced Technology and Engineering Exploration, DOI: </w:t>
+        <w:t>"</w:t>
       </w:r>
-      <w:hyperlink r:id="rId17">
+      <w:hyperlink r:id="rId26">
+        <w:r>
+          <w:rPr>
+            <w:color w:val="0563C1"/>
+            <w:u w:val="single"/>
+            <w:rFonts w:ascii="Times New Roman" w:hAnsi="Times New Roman"/>
+            <w:sz w:val="20"/>
+          </w:rPr>
+          <w:t>i-Net: A Deep CNN Model for White Blood Cancer Segmentation and Classification</w:t>
+        </w:r>
+      </w:hyperlink>
+      <w:r>
+        <w:rPr>
+          <w:rFonts w:ascii="Times New Roman" w:hAnsi="Times New Roman"/>
+          <w:b w:val="0"/>
+          <w:i w:val="0"/>
+          <w:color w:val="222222"/>
+          <w:sz w:val="20"/>
+        </w:rPr>
+        <w:t xml:space="preserve">", International Journal of Advanced Technology and Engineering Exploration, DOI: </w:t>
+      </w:r>
+      <w:hyperlink r:id="rId26">
         <w:r>
           <w:rPr>
             <w:color w:val="0563C1"/>
@@ -1653,9 +2001,30 @@
           <w:color w:val="222222"/>
           <w:sz w:val="20"/>
         </w:rPr>
-        <w:t xml:space="preserve">"ResNet-50 vs VGG-19 vs Training from Scratch: A Comparative Analysis of the Segmentation and Classification of Pneumonia from Chest X-ray Images", Global Transaction Proceedings, DOI: </w:t>
+        <w:t>"</w:t>
       </w:r>
-      <w:hyperlink r:id="rId18">
+      <w:hyperlink r:id="rId27">
+        <w:r>
+          <w:rPr>
+            <w:color w:val="0563C1"/>
+            <w:u w:val="single"/>
+            <w:rFonts w:ascii="Times New Roman" w:hAnsi="Times New Roman"/>
+            <w:sz w:val="20"/>
+          </w:rPr>
+          <w:t>ResNet-50 vs VGG-19 vs Training from Scratch: A Comparative Analysis of the Segmentation and Classification of Pneumonia from Chest X-ray Images</w:t>
+        </w:r>
+      </w:hyperlink>
+      <w:r>
+        <w:rPr>
+          <w:rFonts w:ascii="Times New Roman" w:hAnsi="Times New Roman"/>
+          <w:b w:val="0"/>
+          <w:i w:val="0"/>
+          <w:color w:val="222222"/>
+          <w:sz w:val="20"/>
+        </w:rPr>
+        <w:t xml:space="preserve">", Global Transaction Proceedings, DOI: </w:t>
+      </w:r>
+      <w:hyperlink r:id="rId27">
         <w:r>
           <w:rPr>
             <w:color w:val="0563C1"/>
@@ -1680,9 +2049,30 @@
           <w:color w:val="222222"/>
           <w:sz w:val="20"/>
         </w:rPr>
-        <w:t xml:space="preserve">"Semi-Supervised Labelling of Chest X-Ray Images Using Unsupervised Clustering for Ground-Truth Generation", Applied Engineering and Technology, DOI: </w:t>
+        <w:t>"</w:t>
       </w:r>
-      <w:hyperlink r:id="rId19">
+      <w:hyperlink r:id="rId28">
+        <w:r>
+          <w:rPr>
+            <w:color w:val="0563C1"/>
+            <w:u w:val="single"/>
+            <w:rFonts w:ascii="Times New Roman" w:hAnsi="Times New Roman"/>
+            <w:sz w:val="20"/>
+          </w:rPr>
+          <w:t>Semi-Supervised Labelling of Chest X-Ray Images Using Unsupervised Clustering for Ground-Truth Generation</w:t>
+        </w:r>
+      </w:hyperlink>
+      <w:r>
+        <w:rPr>
+          <w:rFonts w:ascii="Times New Roman" w:hAnsi="Times New Roman"/>
+          <w:b w:val="0"/>
+          <w:i w:val="0"/>
+          <w:color w:val="222222"/>
+          <w:sz w:val="20"/>
+        </w:rPr>
+        <w:t xml:space="preserve">", Applied Engineering and Technology, DOI: </w:t>
+      </w:r>
+      <w:hyperlink r:id="rId28">
         <w:r>
           <w:rPr>
             <w:color w:val="0563C1"/>
@@ -1707,9 +2097,30 @@
           <w:color w:val="222222"/>
           <w:sz w:val="20"/>
         </w:rPr>
-        <w:t xml:space="preserve">"Effective Approach for Fine-Tuning Pre-Trained Models for the Extraction of Texts From Source Codes", ITM Web of Conferences, DOI: </w:t>
+        <w:t>"</w:t>
       </w:r>
-      <w:hyperlink r:id="rId20">
+      <w:hyperlink r:id="rId29">
+        <w:r>
+          <w:rPr>
+            <w:color w:val="0563C1"/>
+            <w:u w:val="single"/>
+            <w:rFonts w:ascii="Times New Roman" w:hAnsi="Times New Roman"/>
+            <w:sz w:val="20"/>
+          </w:rPr>
+          <w:t>Effective Approach for Fine-Tuning Pre-Trained Models for the Extraction of Texts From Source Codes</w:t>
+        </w:r>
+      </w:hyperlink>
+      <w:r>
+        <w:rPr>
+          <w:rFonts w:ascii="Times New Roman" w:hAnsi="Times New Roman"/>
+          <w:b w:val="0"/>
+          <w:i w:val="0"/>
+          <w:color w:val="222222"/>
+          <w:sz w:val="20"/>
+        </w:rPr>
+        <w:t xml:space="preserve">", ITM Web of Conferences, DOI: </w:t>
+      </w:r>
+      <w:hyperlink r:id="rId29">
         <w:r>
           <w:rPr>
             <w:color w:val="0563C1"/>

</xml_diff>